<commit_message>
Article #3 claimed. Removed Article #5
</commit_message>
<xml_diff>
--- a/replication-template.docx
+++ b/replication-template.docx
@@ -36,7 +36,13 @@
         <w:jc w:val="center"/>
       </w:pPr>
       <w:r>
-        <w:t>Repeating the Original Title + (Author, Year)</w:t>
+        <w:rPr>
+          <w:rFonts w:ascii="Aptos" w:hAnsi="Aptos" w:eastAsia="Aptos" w:cs="Aptos" w:asciiTheme="minorHAnsi" w:hAnsiTheme="minorHAnsi" w:eastAsiaTheme="minorHAnsi" w:csTheme="minorBidi"/>
+          <w:kern w:val="2"/>
+          <w:sz w:val="24"/>
+          <w:szCs w:val="24"/>
+        </w:rPr>
+        <w:t>A Replicaiton of "Repeating the Original Title" + (Author, Year)</w:t>
       </w:r>
     </w:p>
     <w:p>
@@ -57,23 +63,13 @@
         <w:jc w:val="both"/>
       </w:pPr>
       <w:r>
-        <w:t xml:space="preserve">One sentence describing the purpose of the original study. One sentence that reports them main findings from the original study. Report the results of your reproduction. If it fails, highlight the main reason or the revised reproduction process. Discuss the robustness reproduction performed. What do the results state about internal validity for the study? At a </w:t>
-      </w:r>
-      <w:proofErr w:type="gramStart"/>
-      <w:r>
-        <w:t>high-level</w:t>
-      </w:r>
-      <w:proofErr w:type="gramEnd"/>
-      <w:r>
-        <w:t xml:space="preserve">, what is the impact this has for </w:t>
-      </w:r>
-      <w:proofErr w:type="gramStart"/>
-      <w:r>
-        <w:t>the PES</w:t>
-      </w:r>
-      <w:proofErr w:type="gramEnd"/>
-      <w:r>
-        <w:t xml:space="preserve"> literature?</w:t>
+        <w:rPr>
+          <w:rFonts w:ascii="Aptos" w:hAnsi="Aptos" w:eastAsia="Aptos" w:cs="Aptos" w:asciiTheme="minorHAnsi" w:hAnsiTheme="minorHAnsi" w:eastAsiaTheme="minorHAnsi" w:csTheme="minorBidi"/>
+          <w:kern w:val="2"/>
+          <w:sz w:val="24"/>
+          <w:szCs w:val="24"/>
+        </w:rPr>
+        <w:t>One sentence describing the purpose of the original study. One sentence that reports the main findings from the original study. Report the results of your reproduction. If it fails, highlight the main reason or the revised reproduction process. Discuss the robustness reproduction performed. What do the results state about internal validity for the study? At a high-level, what is the impact this has for the PES literature?</w:t>
       </w:r>
     </w:p>
     <w:p/>

</xml_diff>